<commit_message>
Update environment variables for production and UAT configurations, enhance payment functionality, and improve documentation
- Updated `.env.deployment.example`, `.env.production.local.example`, and `.env.uat.local.example` to reflect the new Supabase project reference and URLs.
- Added Razorpay payment integration in the customer app, including new components for checkout and payment handling.
- Enhanced the booking detail and booking modal components to support Razorpay payment options.
- Updated the production checklist in `PROD_CHECKLIST.md` to reflect the creation of the new production Supabase project and updated environment values.
- Improved documentation for environment variables in `.env.example` and `.env.production.example` for clarity on production settings.
</commit_message>
<xml_diff>
--- a/project-docs/OorjaMan-E2E-Test-Guide.docx
+++ b/project-docs/OorjaMan-E2E-Test-Guide.docx
@@ -21,7 +21,7 @@
         <w:jc w:val="center"/>
       </w:pPr>
       <w:r>
-        <w:t>For QA testers · 15 June 2026</w:t>
+        <w:t>For QA testers · 22 August 2026</w:t>
       </w:r>
     </w:p>
     <w:p>
@@ -1117,7 +1117,1336 @@
     <w:p/>
     <w:p>
       <w:r>
-        <w:t>Raju (401) already has a home address in Bengaluru and can book visits straight away. Gamusa technicians (301, 303, 304) belong to vendor 201; Bharat Sun technicians (302, 305, 306) belong to vendor 202.</w:t>
+        <w:t>Raju (401) already has a home address in Bengaluru and can book visits straight away. Gamusa technicians (301, 303, 304) belong to vendor 201; Bharat Sun technicians (302, 305, 306) belong to vendor 202. All listed technicians are approved and assigned to a vendor in UAT.</w:t>
+      </w:r>
+    </w:p>
+    <w:p>
+      <w:pPr>
+        <w:pStyle w:val="Heading1"/>
+      </w:pPr>
+      <w:r>
+        <w:t>4a. Razorpay test payments (Test mode — no real money)</w:t>
+      </w:r>
+    </w:p>
+    <w:p>
+      <w:r>
+        <w:t>The customer UAT app uses Razorpay Test mode when configured. Cards below never charge a real bank account. Use a random CVV and any future expiry date for every card. You may save a card in Checkout; Razorpay tokenizes it for later tests.</w:t>
+      </w:r>
+    </w:p>
+    <w:p>
+      <w:r>
+        <w:t>After you start Checkout, on Razorpay’s success/failure screen choose the outcome you want. For error cards, select failure so the mapped error appears.</w:t>
+      </w:r>
+    </w:p>
+    <w:p>
+      <w:pPr>
+        <w:pStyle w:val="Heading2"/>
+      </w:pPr>
+      <w:r>
+        <w:t>Success test cards (Indian networks)</w:t>
+      </w:r>
+    </w:p>
+    <w:tbl>
+      <w:tblPr>
+        <w:tblStyle w:val="TableGrid"/>
+        <w:tblW w:type="auto" w:w="0"/>
+        <w:tblLook w:firstColumn="1" w:firstRow="1" w:lastColumn="0" w:lastRow="0" w:noHBand="0" w:noVBand="1" w:val="04A0"/>
+      </w:tblPr>
+      <w:tblGrid>
+        <w:gridCol w:w="2340"/>
+        <w:gridCol w:w="2340"/>
+        <w:gridCol w:w="2340"/>
+        <w:gridCol w:w="2340"/>
+      </w:tblGrid>
+      <w:tr>
+        <w:tc>
+          <w:tcPr>
+            <w:tcW w:type="dxa" w:w="2340"/>
+            <w:shd w:fill="E8F0FE"/>
+          </w:tcPr>
+          <w:p>
+            <w:r>
+              <w:t>Network</w:t>
+            </w:r>
+          </w:p>
+        </w:tc>
+        <w:tc>
+          <w:tcPr>
+            <w:tcW w:type="dxa" w:w="2340"/>
+            <w:shd w:fill="E8F0FE"/>
+          </w:tcPr>
+          <w:p>
+            <w:r>
+              <w:t>Card number</w:t>
+            </w:r>
+          </w:p>
+        </w:tc>
+        <w:tc>
+          <w:tcPr>
+            <w:tcW w:type="dxa" w:w="2340"/>
+            <w:shd w:fill="E8F0FE"/>
+          </w:tcPr>
+          <w:p>
+            <w:r>
+              <w:t>Type</w:t>
+            </w:r>
+          </w:p>
+        </w:tc>
+        <w:tc>
+          <w:tcPr>
+            <w:tcW w:type="dxa" w:w="2340"/>
+            <w:shd w:fill="E8F0FE"/>
+          </w:tcPr>
+          <w:p>
+            <w:r>
+              <w:t>Sub type</w:t>
+            </w:r>
+          </w:p>
+        </w:tc>
+      </w:tr>
+      <w:tr>
+        <w:tc>
+          <w:tcPr>
+            <w:tcW w:type="dxa" w:w="2340"/>
+          </w:tcPr>
+          <w:p>
+            <w:r>
+              <w:t>Visa</w:t>
+            </w:r>
+          </w:p>
+        </w:tc>
+        <w:tc>
+          <w:tcPr>
+            <w:tcW w:type="dxa" w:w="2340"/>
+          </w:tcPr>
+          <w:p>
+            <w:r>
+              <w:t>4100 2800 0000 1007</w:t>
+            </w:r>
+          </w:p>
+        </w:tc>
+        <w:tc>
+          <w:tcPr>
+            <w:tcW w:type="dxa" w:w="2340"/>
+          </w:tcPr>
+          <w:p>
+            <w:r>
+              <w:t>Debit</w:t>
+            </w:r>
+          </w:p>
+        </w:tc>
+        <w:tc>
+          <w:tcPr>
+            <w:tcW w:type="dxa" w:w="2340"/>
+          </w:tcPr>
+          <w:p>
+            <w:r>
+              <w:t>Consumer</w:t>
+            </w:r>
+          </w:p>
+        </w:tc>
+      </w:tr>
+      <w:tr>
+        <w:tc>
+          <w:tcPr>
+            <w:tcW w:type="dxa" w:w="2340"/>
+          </w:tcPr>
+          <w:p>
+            <w:r>
+              <w:t>Mastercard</w:t>
+            </w:r>
+          </w:p>
+        </w:tc>
+        <w:tc>
+          <w:tcPr>
+            <w:tcW w:type="dxa" w:w="2340"/>
+          </w:tcPr>
+          <w:p>
+            <w:r>
+              <w:t>5555 5100 0008 1006</w:t>
+            </w:r>
+          </w:p>
+        </w:tc>
+        <w:tc>
+          <w:tcPr>
+            <w:tcW w:type="dxa" w:w="2340"/>
+          </w:tcPr>
+          <w:p>
+            <w:r>
+              <w:t>Credit</w:t>
+            </w:r>
+          </w:p>
+        </w:tc>
+        <w:tc>
+          <w:tcPr>
+            <w:tcW w:type="dxa" w:w="2340"/>
+          </w:tcPr>
+          <w:p>
+            <w:r>
+              <w:t>Business</w:t>
+            </w:r>
+          </w:p>
+        </w:tc>
+      </w:tr>
+      <w:tr>
+        <w:tc>
+          <w:tcPr>
+            <w:tcW w:type="dxa" w:w="2340"/>
+          </w:tcPr>
+          <w:p>
+            <w:r>
+              <w:t>Mastercard</w:t>
+            </w:r>
+          </w:p>
+        </w:tc>
+        <w:tc>
+          <w:tcPr>
+            <w:tcW w:type="dxa" w:w="2340"/>
+          </w:tcPr>
+          <w:p>
+            <w:r>
+              <w:t>5180 2872 0009 1001</w:t>
+            </w:r>
+          </w:p>
+        </w:tc>
+        <w:tc>
+          <w:tcPr>
+            <w:tcW w:type="dxa" w:w="2340"/>
+          </w:tcPr>
+          <w:p>
+            <w:r>
+              <w:t>Prepaid</w:t>
+            </w:r>
+          </w:p>
+        </w:tc>
+        <w:tc>
+          <w:tcPr>
+            <w:tcW w:type="dxa" w:w="2340"/>
+          </w:tcPr>
+          <w:p>
+            <w:r>
+              <w:t>Consumer</w:t>
+            </w:r>
+          </w:p>
+        </w:tc>
+      </w:tr>
+      <w:tr>
+        <w:tc>
+          <w:tcPr>
+            <w:tcW w:type="dxa" w:w="2340"/>
+          </w:tcPr>
+          <w:p>
+            <w:r>
+              <w:t>RuPay</w:t>
+            </w:r>
+          </w:p>
+        </w:tc>
+        <w:tc>
+          <w:tcPr>
+            <w:tcW w:type="dxa" w:w="2340"/>
+          </w:tcPr>
+          <w:p>
+            <w:r>
+              <w:t>6527 6589 0000 1005</w:t>
+            </w:r>
+          </w:p>
+        </w:tc>
+        <w:tc>
+          <w:tcPr>
+            <w:tcW w:type="dxa" w:w="2340"/>
+          </w:tcPr>
+          <w:p>
+            <w:r>
+              <w:t>Credit</w:t>
+            </w:r>
+          </w:p>
+        </w:tc>
+        <w:tc>
+          <w:tcPr>
+            <w:tcW w:type="dxa" w:w="2340"/>
+          </w:tcPr>
+          <w:p>
+            <w:r>
+              <w:t>Consumer</w:t>
+            </w:r>
+          </w:p>
+        </w:tc>
+      </w:tr>
+      <w:tr>
+        <w:tc>
+          <w:tcPr>
+            <w:tcW w:type="dxa" w:w="2340"/>
+          </w:tcPr>
+          <w:p>
+            <w:r>
+              <w:t>Diners</w:t>
+            </w:r>
+          </w:p>
+        </w:tc>
+        <w:tc>
+          <w:tcPr>
+            <w:tcW w:type="dxa" w:w="2340"/>
+          </w:tcPr>
+          <w:p>
+            <w:r>
+              <w:t>3608 280009 1007</w:t>
+            </w:r>
+          </w:p>
+        </w:tc>
+        <w:tc>
+          <w:tcPr>
+            <w:tcW w:type="dxa" w:w="2340"/>
+          </w:tcPr>
+          <w:p>
+            <w:r>
+              <w:t>Credit</w:t>
+            </w:r>
+          </w:p>
+        </w:tc>
+        <w:tc>
+          <w:tcPr>
+            <w:tcW w:type="dxa" w:w="2340"/>
+          </w:tcPr>
+          <w:p>
+            <w:r>
+              <w:t>Consumer</w:t>
+            </w:r>
+          </w:p>
+        </w:tc>
+      </w:tr>
+      <w:tr>
+        <w:tc>
+          <w:tcPr>
+            <w:tcW w:type="dxa" w:w="2340"/>
+          </w:tcPr>
+          <w:p>
+            <w:r>
+              <w:t>Amex</w:t>
+            </w:r>
+          </w:p>
+        </w:tc>
+        <w:tc>
+          <w:tcPr>
+            <w:tcW w:type="dxa" w:w="2340"/>
+          </w:tcPr>
+          <w:p>
+            <w:r>
+              <w:t>3402 560004 01007</w:t>
+            </w:r>
+          </w:p>
+        </w:tc>
+        <w:tc>
+          <w:tcPr>
+            <w:tcW w:type="dxa" w:w="2340"/>
+          </w:tcPr>
+          <w:p>
+            <w:r>
+              <w:t>Credit</w:t>
+            </w:r>
+          </w:p>
+        </w:tc>
+        <w:tc>
+          <w:tcPr>
+            <w:tcW w:type="dxa" w:w="2340"/>
+          </w:tcPr>
+          <w:p>
+            <w:r>
+              <w:t>Consumer</w:t>
+            </w:r>
+          </w:p>
+        </w:tc>
+      </w:tr>
+    </w:tbl>
+    <w:p/>
+    <w:p>
+      <w:pPr>
+        <w:pStyle w:val="Heading2"/>
+      </w:pPr>
+      <w:r>
+        <w:t>Error cards — BAD_REQUEST_ERROR</w:t>
+      </w:r>
+    </w:p>
+    <w:p>
+      <w:r>
+        <w:t>CVV &amp; expiry: random CVV + any future date.</w:t>
+      </w:r>
+    </w:p>
+    <w:tbl>
+      <w:tblPr>
+        <w:tblStyle w:val="TableGrid"/>
+        <w:tblW w:type="auto" w:w="0"/>
+        <w:tblLook w:firstColumn="1" w:firstRow="1" w:lastColumn="0" w:lastRow="0" w:noHBand="0" w:noVBand="1" w:val="04A0"/>
+      </w:tblPr>
+      <w:tblGrid>
+        <w:gridCol w:w="2340"/>
+        <w:gridCol w:w="2340"/>
+        <w:gridCol w:w="2340"/>
+        <w:gridCol w:w="2340"/>
+      </w:tblGrid>
+      <w:tr>
+        <w:tc>
+          <w:tcPr>
+            <w:tcW w:type="dxa" w:w="2340"/>
+            <w:shd w:fill="E8F0FE"/>
+          </w:tcPr>
+          <w:p>
+            <w:r>
+              <w:t>Error reason</w:t>
+            </w:r>
+          </w:p>
+        </w:tc>
+        <w:tc>
+          <w:tcPr>
+            <w:tcW w:type="dxa" w:w="2340"/>
+            <w:shd w:fill="E8F0FE"/>
+          </w:tcPr>
+          <w:p>
+            <w:r>
+              <w:t>What Razorpay shows (summary)</w:t>
+            </w:r>
+          </w:p>
+        </w:tc>
+        <w:tc>
+          <w:tcPr>
+            <w:tcW w:type="dxa" w:w="2340"/>
+            <w:shd w:fill="E8F0FE"/>
+          </w:tcPr>
+          <w:p>
+            <w:r>
+              <w:t>Network</w:t>
+            </w:r>
+          </w:p>
+        </w:tc>
+        <w:tc>
+          <w:tcPr>
+            <w:tcW w:type="dxa" w:w="2340"/>
+            <w:shd w:fill="E8F0FE"/>
+          </w:tcPr>
+          <w:p>
+            <w:r>
+              <w:t>Card number</w:t>
+            </w:r>
+          </w:p>
+        </w:tc>
+      </w:tr>
+      <w:tr>
+        <w:tc>
+          <w:tcPr>
+            <w:tcW w:type="dxa" w:w="2340"/>
+          </w:tcPr>
+          <w:p>
+            <w:r>
+              <w:t>payment_timed_out</w:t>
+            </w:r>
+          </w:p>
+        </w:tc>
+        <w:tc>
+          <w:tcPr>
+            <w:tcW w:type="dxa" w:w="2340"/>
+          </w:tcPr>
+          <w:p>
+            <w:r>
+              <w:t>Temporary issue — try again later</w:t>
+            </w:r>
+          </w:p>
+        </w:tc>
+        <w:tc>
+          <w:tcPr>
+            <w:tcW w:type="dxa" w:w="2340"/>
+          </w:tcPr>
+          <w:p>
+            <w:r>
+              <w:t>Visa</w:t>
+            </w:r>
+          </w:p>
+        </w:tc>
+        <w:tc>
+          <w:tcPr>
+            <w:tcW w:type="dxa" w:w="2340"/>
+          </w:tcPr>
+          <w:p>
+            <w:r>
+              <w:t>4100 2800 0009 0000</w:t>
+            </w:r>
+          </w:p>
+        </w:tc>
+      </w:tr>
+      <w:tr>
+        <w:tc>
+          <w:tcPr>
+            <w:tcW w:type="dxa" w:w="2340"/>
+          </w:tcPr>
+          <w:p>
+            <w:r>
+              <w:t>payment_timed_out</w:t>
+            </w:r>
+          </w:p>
+        </w:tc>
+        <w:tc>
+          <w:tcPr>
+            <w:tcW w:type="dxa" w:w="2340"/>
+          </w:tcPr>
+          <w:p>
+            <w:r>
+              <w:t>Temporary issue — try again later</w:t>
+            </w:r>
+          </w:p>
+        </w:tc>
+        <w:tc>
+          <w:tcPr>
+            <w:tcW w:type="dxa" w:w="2340"/>
+          </w:tcPr>
+          <w:p>
+            <w:r>
+              <w:t>Mastercard</w:t>
+            </w:r>
+          </w:p>
+        </w:tc>
+        <w:tc>
+          <w:tcPr>
+            <w:tcW w:type="dxa" w:w="2340"/>
+          </w:tcPr>
+          <w:p>
+            <w:r>
+              <w:t>5305 6200 0006 0000</w:t>
+            </w:r>
+          </w:p>
+        </w:tc>
+      </w:tr>
+      <w:tr>
+        <w:tc>
+          <w:tcPr>
+            <w:tcW w:type="dxa" w:w="2340"/>
+          </w:tcPr>
+          <w:p>
+            <w:r>
+              <w:t>insufficient_fund</w:t>
+            </w:r>
+          </w:p>
+        </w:tc>
+        <w:tc>
+          <w:tcPr>
+            <w:tcW w:type="dxa" w:w="2340"/>
+          </w:tcPr>
+          <w:p>
+            <w:r>
+              <w:t>Insufficient account balance</w:t>
+            </w:r>
+          </w:p>
+        </w:tc>
+        <w:tc>
+          <w:tcPr>
+            <w:tcW w:type="dxa" w:w="2340"/>
+          </w:tcPr>
+          <w:p>
+            <w:r>
+              <w:t>Visa</w:t>
+            </w:r>
+          </w:p>
+        </w:tc>
+        <w:tc>
+          <w:tcPr>
+            <w:tcW w:type="dxa" w:w="2340"/>
+          </w:tcPr>
+          <w:p>
+            <w:r>
+              <w:t>4100 2800 0008 0001</w:t>
+            </w:r>
+          </w:p>
+        </w:tc>
+      </w:tr>
+      <w:tr>
+        <w:tc>
+          <w:tcPr>
+            <w:tcW w:type="dxa" w:w="2340"/>
+          </w:tcPr>
+          <w:p>
+            <w:r>
+              <w:t>insufficient_fund</w:t>
+            </w:r>
+          </w:p>
+        </w:tc>
+        <w:tc>
+          <w:tcPr>
+            <w:tcW w:type="dxa" w:w="2340"/>
+          </w:tcPr>
+          <w:p>
+            <w:r>
+              <w:t>Insufficient account balance</w:t>
+            </w:r>
+          </w:p>
+        </w:tc>
+        <w:tc>
+          <w:tcPr>
+            <w:tcW w:type="dxa" w:w="2340"/>
+          </w:tcPr>
+          <w:p>
+            <w:r>
+              <w:t>Mastercard</w:t>
+            </w:r>
+          </w:p>
+        </w:tc>
+        <w:tc>
+          <w:tcPr>
+            <w:tcW w:type="dxa" w:w="2340"/>
+          </w:tcPr>
+          <w:p>
+            <w:r>
+              <w:t>5305 6200 0005 0001</w:t>
+            </w:r>
+          </w:p>
+        </w:tc>
+      </w:tr>
+      <w:tr>
+        <w:tc>
+          <w:tcPr>
+            <w:tcW w:type="dxa" w:w="2340"/>
+          </w:tcPr>
+          <w:p>
+            <w:r>
+              <w:t>payment_cancelled</w:t>
+            </w:r>
+          </w:p>
+        </w:tc>
+        <w:tc>
+          <w:tcPr>
+            <w:tcW w:type="dxa" w:w="2340"/>
+          </w:tcPr>
+          <w:p>
+            <w:r>
+              <w:t>Payment has been cancelled</w:t>
+            </w:r>
+          </w:p>
+        </w:tc>
+        <w:tc>
+          <w:tcPr>
+            <w:tcW w:type="dxa" w:w="2340"/>
+          </w:tcPr>
+          <w:p>
+            <w:r>
+              <w:t>Visa</w:t>
+            </w:r>
+          </w:p>
+        </w:tc>
+        <w:tc>
+          <w:tcPr>
+            <w:tcW w:type="dxa" w:w="2340"/>
+          </w:tcPr>
+          <w:p>
+            <w:r>
+              <w:t>4100 2800 0007 0002</w:t>
+            </w:r>
+          </w:p>
+        </w:tc>
+      </w:tr>
+      <w:tr>
+        <w:tc>
+          <w:tcPr>
+            <w:tcW w:type="dxa" w:w="2340"/>
+          </w:tcPr>
+          <w:p>
+            <w:r>
+              <w:t>payment_cancelled</w:t>
+            </w:r>
+          </w:p>
+        </w:tc>
+        <w:tc>
+          <w:tcPr>
+            <w:tcW w:type="dxa" w:w="2340"/>
+          </w:tcPr>
+          <w:p>
+            <w:r>
+              <w:t>Payment has been cancelled</w:t>
+            </w:r>
+          </w:p>
+        </w:tc>
+        <w:tc>
+          <w:tcPr>
+            <w:tcW w:type="dxa" w:w="2340"/>
+          </w:tcPr>
+          <w:p>
+            <w:r>
+              <w:t>Mastercard</w:t>
+            </w:r>
+          </w:p>
+        </w:tc>
+        <w:tc>
+          <w:tcPr>
+            <w:tcW w:type="dxa" w:w="2340"/>
+          </w:tcPr>
+          <w:p>
+            <w:r>
+              <w:t>5305 6200 0004 0002</w:t>
+            </w:r>
+          </w:p>
+        </w:tc>
+      </w:tr>
+      <w:tr>
+        <w:tc>
+          <w:tcPr>
+            <w:tcW w:type="dxa" w:w="2340"/>
+          </w:tcPr>
+          <w:p>
+            <w:r>
+              <w:t>card_declined</w:t>
+            </w:r>
+          </w:p>
+        </w:tc>
+        <w:tc>
+          <w:tcPr>
+            <w:tcW w:type="dxa" w:w="2340"/>
+          </w:tcPr>
+          <w:p>
+            <w:r>
+              <w:t>Declined by the bank</w:t>
+            </w:r>
+          </w:p>
+        </w:tc>
+        <w:tc>
+          <w:tcPr>
+            <w:tcW w:type="dxa" w:w="2340"/>
+          </w:tcPr>
+          <w:p>
+            <w:r>
+              <w:t>Visa</w:t>
+            </w:r>
+          </w:p>
+        </w:tc>
+        <w:tc>
+          <w:tcPr>
+            <w:tcW w:type="dxa" w:w="2340"/>
+          </w:tcPr>
+          <w:p>
+            <w:r>
+              <w:t>4100 2800 0006 0003</w:t>
+            </w:r>
+          </w:p>
+        </w:tc>
+      </w:tr>
+      <w:tr>
+        <w:tc>
+          <w:tcPr>
+            <w:tcW w:type="dxa" w:w="2340"/>
+          </w:tcPr>
+          <w:p>
+            <w:r>
+              <w:t>card_declined</w:t>
+            </w:r>
+          </w:p>
+        </w:tc>
+        <w:tc>
+          <w:tcPr>
+            <w:tcW w:type="dxa" w:w="2340"/>
+          </w:tcPr>
+          <w:p>
+            <w:r>
+              <w:t>Declined by the bank</w:t>
+            </w:r>
+          </w:p>
+        </w:tc>
+        <w:tc>
+          <w:tcPr>
+            <w:tcW w:type="dxa" w:w="2340"/>
+          </w:tcPr>
+          <w:p>
+            <w:r>
+              <w:t>Mastercard</w:t>
+            </w:r>
+          </w:p>
+        </w:tc>
+        <w:tc>
+          <w:tcPr>
+            <w:tcW w:type="dxa" w:w="2340"/>
+          </w:tcPr>
+          <w:p>
+            <w:r>
+              <w:t>5305 6200 0003 0003</w:t>
+            </w:r>
+          </w:p>
+        </w:tc>
+      </w:tr>
+      <w:tr>
+        <w:tc>
+          <w:tcPr>
+            <w:tcW w:type="dxa" w:w="2340"/>
+          </w:tcPr>
+          <w:p>
+            <w:r>
+              <w:t>card_declined</w:t>
+            </w:r>
+          </w:p>
+        </w:tc>
+        <w:tc>
+          <w:tcPr>
+            <w:tcW w:type="dxa" w:w="2340"/>
+          </w:tcPr>
+          <w:p>
+            <w:r>
+              <w:t>Declined by the bank</w:t>
+            </w:r>
+          </w:p>
+        </w:tc>
+        <w:tc>
+          <w:tcPr>
+            <w:tcW w:type="dxa" w:w="2340"/>
+          </w:tcPr>
+          <w:p>
+            <w:r>
+              <w:t>Visa</w:t>
+            </w:r>
+          </w:p>
+        </w:tc>
+        <w:tc>
+          <w:tcPr>
+            <w:tcW w:type="dxa" w:w="2340"/>
+          </w:tcPr>
+          <w:p>
+            <w:r>
+              <w:t>4100 2800 0005 0004</w:t>
+            </w:r>
+          </w:p>
+        </w:tc>
+      </w:tr>
+      <w:tr>
+        <w:tc>
+          <w:tcPr>
+            <w:tcW w:type="dxa" w:w="2340"/>
+          </w:tcPr>
+          <w:p>
+            <w:r>
+              <w:t>card_declined</w:t>
+            </w:r>
+          </w:p>
+        </w:tc>
+        <w:tc>
+          <w:tcPr>
+            <w:tcW w:type="dxa" w:w="2340"/>
+          </w:tcPr>
+          <w:p>
+            <w:r>
+              <w:t>Declined by the bank</w:t>
+            </w:r>
+          </w:p>
+        </w:tc>
+        <w:tc>
+          <w:tcPr>
+            <w:tcW w:type="dxa" w:w="2340"/>
+          </w:tcPr>
+          <w:p>
+            <w:r>
+              <w:t>Mastercard</w:t>
+            </w:r>
+          </w:p>
+        </w:tc>
+        <w:tc>
+          <w:tcPr>
+            <w:tcW w:type="dxa" w:w="2340"/>
+          </w:tcPr>
+          <w:p>
+            <w:r>
+              <w:t>5305 6200 0002 0004</w:t>
+            </w:r>
+          </w:p>
+        </w:tc>
+      </w:tr>
+      <w:tr>
+        <w:tc>
+          <w:tcPr>
+            <w:tcW w:type="dxa" w:w="2340"/>
+          </w:tcPr>
+          <w:p>
+            <w:r>
+              <w:t>card_declined</w:t>
+            </w:r>
+          </w:p>
+        </w:tc>
+        <w:tc>
+          <w:tcPr>
+            <w:tcW w:type="dxa" w:w="2340"/>
+          </w:tcPr>
+          <w:p>
+            <w:r>
+              <w:t>Declined by the bank</w:t>
+            </w:r>
+          </w:p>
+        </w:tc>
+        <w:tc>
+          <w:tcPr>
+            <w:tcW w:type="dxa" w:w="2340"/>
+          </w:tcPr>
+          <w:p>
+            <w:r>
+              <w:t>Visa</w:t>
+            </w:r>
+          </w:p>
+        </w:tc>
+        <w:tc>
+          <w:tcPr>
+            <w:tcW w:type="dxa" w:w="2340"/>
+          </w:tcPr>
+          <w:p>
+            <w:r>
+              <w:t>4100 2800 0004 0005</w:t>
+            </w:r>
+          </w:p>
+        </w:tc>
+      </w:tr>
+      <w:tr>
+        <w:tc>
+          <w:tcPr>
+            <w:tcW w:type="dxa" w:w="2340"/>
+          </w:tcPr>
+          <w:p>
+            <w:r>
+              <w:t>card_declined</w:t>
+            </w:r>
+          </w:p>
+        </w:tc>
+        <w:tc>
+          <w:tcPr>
+            <w:tcW w:type="dxa" w:w="2340"/>
+          </w:tcPr>
+          <w:p>
+            <w:r>
+              <w:t>Declined by the bank</w:t>
+            </w:r>
+          </w:p>
+        </w:tc>
+        <w:tc>
+          <w:tcPr>
+            <w:tcW w:type="dxa" w:w="2340"/>
+          </w:tcPr>
+          <w:p>
+            <w:r>
+              <w:t>Mastercard</w:t>
+            </w:r>
+          </w:p>
+        </w:tc>
+        <w:tc>
+          <w:tcPr>
+            <w:tcW w:type="dxa" w:w="2340"/>
+          </w:tcPr>
+          <w:p>
+            <w:r>
+              <w:t>5305 6200 0001 0005</w:t>
+            </w:r>
+          </w:p>
+        </w:tc>
+      </w:tr>
+      <w:tr>
+        <w:tc>
+          <w:tcPr>
+            <w:tcW w:type="dxa" w:w="2340"/>
+          </w:tcPr>
+          <w:p>
+            <w:r>
+              <w:t>card_disabled_for_online_payments</w:t>
+            </w:r>
+          </w:p>
+        </w:tc>
+        <w:tc>
+          <w:tcPr>
+            <w:tcW w:type="dxa" w:w="2340"/>
+          </w:tcPr>
+          <w:p>
+            <w:r>
+              <w:t>Card disabled for online payments</w:t>
+            </w:r>
+          </w:p>
+        </w:tc>
+        <w:tc>
+          <w:tcPr>
+            <w:tcW w:type="dxa" w:w="2340"/>
+          </w:tcPr>
+          <w:p>
+            <w:r>
+              <w:t>Visa</w:t>
+            </w:r>
+          </w:p>
+        </w:tc>
+        <w:tc>
+          <w:tcPr>
+            <w:tcW w:type="dxa" w:w="2340"/>
+          </w:tcPr>
+          <w:p>
+            <w:r>
+              <w:t>4100 2800 0003 0006</w:t>
+            </w:r>
+          </w:p>
+        </w:tc>
+      </w:tr>
+      <w:tr>
+        <w:tc>
+          <w:tcPr>
+            <w:tcW w:type="dxa" w:w="2340"/>
+          </w:tcPr>
+          <w:p>
+            <w:r>
+              <w:t>card_disabled_for_online_payments</w:t>
+            </w:r>
+          </w:p>
+        </w:tc>
+        <w:tc>
+          <w:tcPr>
+            <w:tcW w:type="dxa" w:w="2340"/>
+          </w:tcPr>
+          <w:p>
+            <w:r>
+              <w:t>Card disabled for online payments</w:t>
+            </w:r>
+          </w:p>
+        </w:tc>
+        <w:tc>
+          <w:tcPr>
+            <w:tcW w:type="dxa" w:w="2340"/>
+          </w:tcPr>
+          <w:p>
+            <w:r>
+              <w:t>Mastercard</w:t>
+            </w:r>
+          </w:p>
+        </w:tc>
+        <w:tc>
+          <w:tcPr>
+            <w:tcW w:type="dxa" w:w="2340"/>
+          </w:tcPr>
+          <w:p>
+            <w:r>
+              <w:t>5305 6200 0000 0006</w:t>
+            </w:r>
+          </w:p>
+        </w:tc>
+      </w:tr>
+      <w:tr>
+        <w:tc>
+          <w:tcPr>
+            <w:tcW w:type="dxa" w:w="2340"/>
+          </w:tcPr>
+          <w:p>
+            <w:r>
+              <w:t>card_number_invalid</w:t>
+            </w:r>
+          </w:p>
+        </w:tc>
+        <w:tc>
+          <w:tcPr>
+            <w:tcW w:type="dxa" w:w="2340"/>
+          </w:tcPr>
+          <w:p>
+            <w:r>
+              <w:t>Incorrect card number</w:t>
+            </w:r>
+          </w:p>
+        </w:tc>
+        <w:tc>
+          <w:tcPr>
+            <w:tcW w:type="dxa" w:w="2340"/>
+          </w:tcPr>
+          <w:p>
+            <w:r>
+              <w:t>Visa</w:t>
+            </w:r>
+          </w:p>
+        </w:tc>
+        <w:tc>
+          <w:tcPr>
+            <w:tcW w:type="dxa" w:w="2340"/>
+          </w:tcPr>
+          <w:p>
+            <w:r>
+              <w:t>4100 2800 0001 0008</w:t>
+            </w:r>
+          </w:p>
+        </w:tc>
+      </w:tr>
+      <w:tr>
+        <w:tc>
+          <w:tcPr>
+            <w:tcW w:type="dxa" w:w="2340"/>
+          </w:tcPr>
+          <w:p>
+            <w:r>
+              <w:t>card_number_invalid</w:t>
+            </w:r>
+          </w:p>
+        </w:tc>
+        <w:tc>
+          <w:tcPr>
+            <w:tcW w:type="dxa" w:w="2340"/>
+          </w:tcPr>
+          <w:p>
+            <w:r>
+              <w:t>Incorrect card number</w:t>
+            </w:r>
+          </w:p>
+        </w:tc>
+        <w:tc>
+          <w:tcPr>
+            <w:tcW w:type="dxa" w:w="2340"/>
+          </w:tcPr>
+          <w:p>
+            <w:r>
+              <w:t>Mastercard</w:t>
+            </w:r>
+          </w:p>
+        </w:tc>
+        <w:tc>
+          <w:tcPr>
+            <w:tcW w:type="dxa" w:w="2340"/>
+          </w:tcPr>
+          <w:p>
+            <w:r>
+              <w:t>5305 6200 0008 0008</w:t>
+            </w:r>
+          </w:p>
+        </w:tc>
+      </w:tr>
+    </w:tbl>
+    <w:p/>
+    <w:p>
+      <w:pPr>
+        <w:pStyle w:val="Heading2"/>
+      </w:pPr>
+      <w:r>
+        <w:t>Error cards — GATEWAY_ERROR</w:t>
+      </w:r>
+    </w:p>
+    <w:p>
+      <w:r>
+        <w:t>CVV &amp; expiry: random CVV + any future date.</w:t>
+      </w:r>
+    </w:p>
+    <w:tbl>
+      <w:tblPr>
+        <w:tblStyle w:val="TableGrid"/>
+        <w:tblW w:type="auto" w:w="0"/>
+        <w:tblLook w:firstColumn="1" w:firstRow="1" w:lastColumn="0" w:lastRow="0" w:noHBand="0" w:noVBand="1" w:val="04A0"/>
+      </w:tblPr>
+      <w:tblGrid>
+        <w:gridCol w:w="2340"/>
+        <w:gridCol w:w="2340"/>
+        <w:gridCol w:w="2340"/>
+        <w:gridCol w:w="2340"/>
+      </w:tblGrid>
+      <w:tr>
+        <w:tc>
+          <w:tcPr>
+            <w:tcW w:type="dxa" w:w="2340"/>
+            <w:shd w:fill="E8F0FE"/>
+          </w:tcPr>
+          <w:p>
+            <w:r>
+              <w:t>Error reason</w:t>
+            </w:r>
+          </w:p>
+        </w:tc>
+        <w:tc>
+          <w:tcPr>
+            <w:tcW w:type="dxa" w:w="2340"/>
+            <w:shd w:fill="E8F0FE"/>
+          </w:tcPr>
+          <w:p>
+            <w:r>
+              <w:t>What Razorpay shows (summary)</w:t>
+            </w:r>
+          </w:p>
+        </w:tc>
+        <w:tc>
+          <w:tcPr>
+            <w:tcW w:type="dxa" w:w="2340"/>
+            <w:shd w:fill="E8F0FE"/>
+          </w:tcPr>
+          <w:p>
+            <w:r>
+              <w:t>Network</w:t>
+            </w:r>
+          </w:p>
+        </w:tc>
+        <w:tc>
+          <w:tcPr>
+            <w:tcW w:type="dxa" w:w="2340"/>
+            <w:shd w:fill="E8F0FE"/>
+          </w:tcPr>
+          <w:p>
+            <w:r>
+              <w:t>Card number</w:t>
+            </w:r>
+          </w:p>
+        </w:tc>
+      </w:tr>
+      <w:tr>
+        <w:tc>
+          <w:tcPr>
+            <w:tcW w:type="dxa" w:w="2340"/>
+          </w:tcPr>
+          <w:p>
+            <w:r>
+              <w:t>gateway_technical_error</w:t>
+            </w:r>
+          </w:p>
+        </w:tc>
+        <w:tc>
+          <w:tcPr>
+            <w:tcW w:type="dxa" w:w="2340"/>
+          </w:tcPr>
+          <w:p>
+            <w:r>
+              <w:t>Temporary issue; refund in 4–5 business days if debited</w:t>
+            </w:r>
+          </w:p>
+        </w:tc>
+        <w:tc>
+          <w:tcPr>
+            <w:tcW w:type="dxa" w:w="2340"/>
+          </w:tcPr>
+          <w:p>
+            <w:r>
+              <w:t>Visa</w:t>
+            </w:r>
+          </w:p>
+        </w:tc>
+        <w:tc>
+          <w:tcPr>
+            <w:tcW w:type="dxa" w:w="2340"/>
+          </w:tcPr>
+          <w:p>
+            <w:r>
+              <w:t>4100 2800 0002 0007</w:t>
+            </w:r>
+          </w:p>
+        </w:tc>
+      </w:tr>
+      <w:tr>
+        <w:tc>
+          <w:tcPr>
+            <w:tcW w:type="dxa" w:w="2340"/>
+          </w:tcPr>
+          <w:p>
+            <w:r>
+              <w:t>gateway_technical_error</w:t>
+            </w:r>
+          </w:p>
+        </w:tc>
+        <w:tc>
+          <w:tcPr>
+            <w:tcW w:type="dxa" w:w="2340"/>
+          </w:tcPr>
+          <w:p>
+            <w:r>
+              <w:t>Temporary issue; refund in 4–5 business days if debited</w:t>
+            </w:r>
+          </w:p>
+        </w:tc>
+        <w:tc>
+          <w:tcPr>
+            <w:tcW w:type="dxa" w:w="2340"/>
+          </w:tcPr>
+          <w:p>
+            <w:r>
+              <w:t>Mastercard</w:t>
+            </w:r>
+          </w:p>
+        </w:tc>
+        <w:tc>
+          <w:tcPr>
+            <w:tcW w:type="dxa" w:w="2340"/>
+          </w:tcPr>
+          <w:p>
+            <w:r>
+              <w:t>5305 6200 0009 0007</w:t>
+            </w:r>
+          </w:p>
+        </w:tc>
+      </w:tr>
+      <w:tr>
+        <w:tc>
+          <w:tcPr>
+            <w:tcW w:type="dxa" w:w="2340"/>
+          </w:tcPr>
+          <w:p>
+            <w:r>
+              <w:t>authentication_failed</w:t>
+            </w:r>
+          </w:p>
+        </w:tc>
+        <w:tc>
+          <w:tcPr>
+            <w:tcW w:type="dxa" w:w="2340"/>
+          </w:tcPr>
+          <w:p>
+            <w:r>
+              <w:t>Incorrect OTP / verification details</w:t>
+            </w:r>
+          </w:p>
+        </w:tc>
+        <w:tc>
+          <w:tcPr>
+            <w:tcW w:type="dxa" w:w="2340"/>
+          </w:tcPr>
+          <w:p>
+            <w:r>
+              <w:t>Visa</w:t>
+            </w:r>
+          </w:p>
+        </w:tc>
+        <w:tc>
+          <w:tcPr>
+            <w:tcW w:type="dxa" w:w="2340"/>
+          </w:tcPr>
+          <w:p>
+            <w:r>
+              <w:t>4100 2800 0000 0009</w:t>
+            </w:r>
+          </w:p>
+        </w:tc>
+      </w:tr>
+      <w:tr>
+        <w:tc>
+          <w:tcPr>
+            <w:tcW w:type="dxa" w:w="2340"/>
+          </w:tcPr>
+          <w:p>
+            <w:r>
+              <w:t>authentication_failed</w:t>
+            </w:r>
+          </w:p>
+        </w:tc>
+        <w:tc>
+          <w:tcPr>
+            <w:tcW w:type="dxa" w:w="2340"/>
+          </w:tcPr>
+          <w:p>
+            <w:r>
+              <w:t>Incorrect OTP / verification details</w:t>
+            </w:r>
+          </w:p>
+        </w:tc>
+        <w:tc>
+          <w:tcPr>
+            <w:tcW w:type="dxa" w:w="2340"/>
+          </w:tcPr>
+          <w:p>
+            <w:r>
+              <w:t>Mastercard</w:t>
+            </w:r>
+          </w:p>
+        </w:tc>
+        <w:tc>
+          <w:tcPr>
+            <w:tcW w:type="dxa" w:w="2340"/>
+          </w:tcPr>
+          <w:p>
+            <w:r>
+              <w:t>5305 6200 0007 0009</w:t>
+            </w:r>
+          </w:p>
+        </w:tc>
+      </w:tr>
+    </w:tbl>
+    <w:p/>
+    <w:p>
+      <w:r>
+        <w:t>More detail for engineers: project-docs/RAZORPAY-UAT-MATRIX.md and project-docs/RAZORPAY.md.</w:t>
       </w:r>
     </w:p>
     <w:p>
@@ -1315,7 +2644,7 @@
         <w:rPr>
           <w:b/>
         </w:rPr>
-        <w:t>Test 6.2: Book a visit</w:t>
+        <w:t>Test 6.2: Book a visit — Pay now (Razorpay success)</w:t>
       </w:r>
     </w:p>
     <w:p>
@@ -1328,7 +2657,7 @@
         <w:pStyle w:val="ListNumber"/>
       </w:pPr>
       <w:r>
-        <w:t>From Home, start a new booking.</w:t>
+        <w:t>From Home, start a new booking and complete scheduling.</w:t>
       </w:r>
     </w:p>
     <w:p>
@@ -1336,7 +2665,7 @@
         <w:pStyle w:val="ListNumber"/>
       </w:pPr>
       <w:r>
-        <w:t>Pick a date and time slot.</w:t>
+        <w:t>On payment, choose Pay now.</w:t>
       </w:r>
     </w:p>
     <w:p>
@@ -1344,7 +2673,23 @@
         <w:pStyle w:val="ListNumber"/>
       </w:pPr>
       <w:r>
-        <w:t>Review the price and confirm payment (test mode—no real money).</w:t>
+        <w:t>Tap Proceed to pay (Powered by Razorpay caption is OK).</w:t>
+      </w:r>
+    </w:p>
+    <w:p>
+      <w:pPr>
+        <w:pStyle w:val="ListNumber"/>
+      </w:pPr>
+      <w:r>
+        <w:t>In Razorpay Checkout, pay with Visa success card 4100 2800 0000 1007 (OTP 123456 / bank test OTP if asked).</w:t>
+      </w:r>
+    </w:p>
+    <w:p>
+      <w:pPr>
+        <w:pStyle w:val="ListNumber"/>
+      </w:pPr>
+      <w:r>
+        <w:t>Wait on Confirming payment until Booking confirmed.</w:t>
       </w:r>
     </w:p>
     <w:p>
@@ -1357,7 +2702,7 @@
         <w:pStyle w:val="ListBullet"/>
       </w:pPr>
       <w:r>
-        <w:t>Booking appears under the Bookings tab.</w:t>
+        <w:t>Confirming timer appears, then Booking confirmed.</w:t>
       </w:r>
     </w:p>
     <w:p>
@@ -1365,7 +2710,31 @@
         <w:pStyle w:val="ListBullet"/>
       </w:pPr>
       <w:r>
-        <w:t>You can open the booking detail screen.</w:t>
+        <w:t>Payment summary shows amount + GST.</w:t>
+      </w:r>
+    </w:p>
+    <w:p>
+      <w:pPr>
+        <w:pStyle w:val="ListBullet"/>
+      </w:pPr>
+      <w:r>
+        <w:t>How you paid shows Status Paid, Paid via Razorpay, Method (e.g. Card), Order ID and Payment ID.</w:t>
+      </w:r>
+    </w:p>
+    <w:p>
+      <w:pPr>
+        <w:pStyle w:val="ListBullet"/>
+      </w:pPr>
+      <w:r>
+        <w:t>No cryptic truncated “Booking dccb…” line is required.</w:t>
+      </w:r>
+    </w:p>
+    <w:p>
+      <w:pPr>
+        <w:pStyle w:val="ListBullet"/>
+      </w:pPr>
+      <w:r>
+        <w:t>Booking appears under My bookings.</w:t>
       </w:r>
     </w:p>
     <w:p/>
@@ -1374,7 +2743,7 @@
         <w:rPr>
           <w:b/>
         </w:rPr>
-        <w:t>Test 6.3: Track a visit</w:t>
+        <w:t>Test 6.3: Book a visit — Pay after service</w:t>
       </w:r>
     </w:p>
     <w:p>
@@ -1387,7 +2756,149 @@
         <w:pStyle w:val="ListNumber"/>
       </w:pPr>
       <w:r>
-        <w:t>Ask a colleague to assign a technician (see section 10) or use an existing active booking.</w:t>
+        <w:t>Start another booking.</w:t>
+      </w:r>
+    </w:p>
+    <w:p>
+      <w:pPr>
+        <w:pStyle w:val="ListNumber"/>
+      </w:pPr>
+      <w:r>
+        <w:t>On payment, choose Pay after service.</w:t>
+      </w:r>
+    </w:p>
+    <w:p>
+      <w:pPr>
+        <w:pStyle w:val="ListNumber"/>
+      </w:pPr>
+      <w:r>
+        <w:t>Confirm booking (no Razorpay Checkout).</w:t>
+      </w:r>
+    </w:p>
+    <w:p>
+      <w:r>
+        <w:t>Pass if:</w:t>
+      </w:r>
+    </w:p>
+    <w:p>
+      <w:pPr>
+        <w:pStyle w:val="ListBullet"/>
+      </w:pPr>
+      <w:r>
+        <w:t>Booking confirmed without charging now.</w:t>
+      </w:r>
+    </w:p>
+    <w:p>
+      <w:pPr>
+        <w:pStyle w:val="ListBullet"/>
+      </w:pPr>
+      <w:r>
+        <w:t>How you paid (or success copy) makes clear payment is after cleaning.</w:t>
+      </w:r>
+    </w:p>
+    <w:p>
+      <w:pPr>
+        <w:pStyle w:val="ListBullet"/>
+      </w:pPr>
+      <w:r>
+        <w:t>Booking appears under My bookings as unpaid / pay later as designed.</w:t>
+      </w:r>
+    </w:p>
+    <w:p/>
+    <w:p>
+      <w:r>
+        <w:rPr>
+          <w:b/>
+        </w:rPr>
+        <w:t>Test 6.4: Razorpay failure then retry</w:t>
+      </w:r>
+    </w:p>
+    <w:p>
+      <w:r>
+        <w:t>What to do:</w:t>
+      </w:r>
+    </w:p>
+    <w:p>
+      <w:pPr>
+        <w:pStyle w:val="ListNumber"/>
+      </w:pPr>
+      <w:r>
+        <w:t>Start a prepaid booking to Checkout.</w:t>
+      </w:r>
+    </w:p>
+    <w:p>
+      <w:pPr>
+        <w:pStyle w:val="ListNumber"/>
+      </w:pPr>
+      <w:r>
+        <w:t>Pay with insufficient-funds Visa 4100 2800 0008 0001 and select failure on Razorpay’s screen.</w:t>
+      </w:r>
+    </w:p>
+    <w:p>
+      <w:pPr>
+        <w:pStyle w:val="ListNumber"/>
+      </w:pPr>
+      <w:r>
+        <w:t>On Booking not completed, tap Try again.</w:t>
+      </w:r>
+    </w:p>
+    <w:p>
+      <w:pPr>
+        <w:pStyle w:val="ListNumber"/>
+      </w:pPr>
+      <w:r>
+        <w:t>Complete with success Visa 4100 2800 0000 1007.</w:t>
+      </w:r>
+    </w:p>
+    <w:p>
+      <w:r>
+        <w:t>Pass if:</w:t>
+      </w:r>
+    </w:p>
+    <w:p>
+      <w:pPr>
+        <w:pStyle w:val="ListBullet"/>
+      </w:pPr>
+      <w:r>
+        <w:t>First attempt shows a clear failure message and Try again / Back.</w:t>
+      </w:r>
+    </w:p>
+    <w:p>
+      <w:pPr>
+        <w:pStyle w:val="ListBullet"/>
+      </w:pPr>
+      <w:r>
+        <w:t>Booking is not confirmed after the failure.</w:t>
+      </w:r>
+    </w:p>
+    <w:p>
+      <w:pPr>
+        <w:pStyle w:val="ListBullet"/>
+      </w:pPr>
+      <w:r>
+        <w:t>Second attempt reaches Booking confirmed with How you paid.</w:t>
+      </w:r>
+    </w:p>
+    <w:p/>
+    <w:p>
+      <w:r>
+        <w:rPr>
+          <w:b/>
+        </w:rPr>
+        <w:t>Test 6.5: Track a visit</w:t>
+      </w:r>
+    </w:p>
+    <w:p>
+      <w:r>
+        <w:t>What to do:</w:t>
+      </w:r>
+    </w:p>
+    <w:p>
+      <w:pPr>
+        <w:pStyle w:val="ListNumber"/>
+      </w:pPr>
+      <w:r>
+        <w:t>Ask a colleague to assign a technician (see section 9) or use an existing active booking.</w:t>
       </w:r>
     </w:p>
     <w:p>
@@ -1425,7 +2936,7 @@
         <w:rPr>
           <w:b/>
         </w:rPr>
-        <w:t>Test 6.4: Other tabs</w:t>
+        <w:t>Test 6.6: Other tabs</w:t>
       </w:r>
     </w:p>
     <w:p>
@@ -1476,7 +2987,7 @@
         <w:rPr>
           <w:b/>
         </w:rPr>
-        <w:t>Test 6.5: Wrong app</w:t>
+        <w:t>Test 6.7: Wrong app</w:t>
       </w:r>
     </w:p>
     <w:p>
@@ -1688,7 +3199,66 @@
         <w:rPr>
           <w:b/>
         </w:rPr>
-        <w:t>Test 7.4: New technician setup (optional)</w:t>
+        <w:t>Test 7.4: Collect payment after a pay-later visit</w:t>
+      </w:r>
+    </w:p>
+    <w:p>
+      <w:r>
+        <w:t>What to do:</w:t>
+      </w:r>
+    </w:p>
+    <w:p>
+      <w:pPr>
+        <w:pStyle w:val="ListNumber"/>
+      </w:pPr>
+      <w:r>
+        <w:t>Complete a visit that was booked as Pay after service.</w:t>
+      </w:r>
+    </w:p>
+    <w:p>
+      <w:pPr>
+        <w:pStyle w:val="ListNumber"/>
+      </w:pPr>
+      <w:r>
+        <w:t>Open the collect / payment screen after completion (QR or link for the customer).</w:t>
+      </w:r>
+    </w:p>
+    <w:p>
+      <w:pPr>
+        <w:pStyle w:val="ListNumber"/>
+      </w:pPr>
+      <w:r>
+        <w:t>Either: customer pays via app/QR with a success test card, or mark partner collected if that option is shown.</w:t>
+      </w:r>
+    </w:p>
+    <w:p>
+      <w:r>
+        <w:t>Pass if:</w:t>
+      </w:r>
+    </w:p>
+    <w:p>
+      <w:pPr>
+        <w:pStyle w:val="ListBullet"/>
+      </w:pPr>
+      <w:r>
+        <w:t>Outstanding amount can be cleared.</w:t>
+      </w:r>
+    </w:p>
+    <w:p>
+      <w:pPr>
+        <w:pStyle w:val="ListBullet"/>
+      </w:pPr>
+      <w:r>
+        <w:t>Customer booking no longer shows unpaid for that visit.</w:t>
+      </w:r>
+    </w:p>
+    <w:p/>
+    <w:p>
+      <w:r>
+        <w:rPr>
+          <w:b/>
+        </w:rPr>
+        <w:t>Test 7.5: New technician setup (optional)</w:t>
       </w:r>
     </w:p>
     <w:p>
@@ -1879,6 +3449,14 @@
       </w:r>
     </w:p>
     <w:p>
+      <w:pPr>
+        <w:pStyle w:val="ListNumber"/>
+      </w:pPr>
+      <w:r>
+        <w:t>Confirm Amit Das (301) is listed under Gamusa Green Energy.</w:t>
+      </w:r>
+    </w:p>
+    <w:p>
       <w:r>
         <w:t>Pass if:</w:t>
       </w:r>
@@ -1889,6 +3467,65 @@
       </w:pPr>
       <w:r>
         <w:t>Lists load and show expected partners.</w:t>
+      </w:r>
+    </w:p>
+    <w:p>
+      <w:pPr>
+        <w:pStyle w:val="ListBullet"/>
+      </w:pPr>
+      <w:r>
+        <w:t>Amit is assigned to Gamusa.</w:t>
+      </w:r>
+    </w:p>
+    <w:p/>
+    <w:p>
+      <w:r>
+        <w:rPr>
+          <w:b/>
+        </w:rPr>
+        <w:t>Test 8.4: Payments ops</w:t>
+      </w:r>
+    </w:p>
+    <w:p>
+      <w:r>
+        <w:t>What to do:</w:t>
+      </w:r>
+    </w:p>
+    <w:p>
+      <w:pPr>
+        <w:pStyle w:val="ListNumber"/>
+      </w:pPr>
+      <w:r>
+        <w:t>Open Finance → Payments (or Payments under finance).</w:t>
+      </w:r>
+    </w:p>
+    <w:p>
+      <w:pPr>
+        <w:pStyle w:val="ListNumber"/>
+      </w:pPr>
+      <w:r>
+        <w:t>Find the payment from a successful Razorpay booking (search by order id if needed).</w:t>
+      </w:r>
+    </w:p>
+    <w:p>
+      <w:r>
+        <w:t>Pass if:</w:t>
+      </w:r>
+    </w:p>
+    <w:p>
+      <w:pPr>
+        <w:pStyle w:val="ListBullet"/>
+      </w:pPr>
+      <w:r>
+        <w:t>Payment list loads.</w:t>
+      </w:r>
+    </w:p>
+    <w:p>
+      <w:pPr>
+        <w:pStyle w:val="ListBullet"/>
+      </w:pPr>
+      <w:r>
+        <w:t>Detail shows Razorpay order / payment ids and status (no card numbers or secrets).</w:t>
       </w:r>
     </w:p>
     <w:p/>
@@ -2135,7 +3772,7 @@
         <w:pStyle w:val="ListNumber"/>
       </w:pPr>
       <w:r>
-        <w:t>Customer Raju (401) books a cleaning visit in the customer app.</w:t>
+        <w:t>Customer Raju (401) books a cleaning visit with Pay now and pays with Visa 4100 2800 0000 1007.</w:t>
       </w:r>
     </w:p>
     <w:p>
@@ -2143,7 +3780,15 @@
         <w:pStyle w:val="ListNumber"/>
       </w:pPr>
       <w:r>
-        <w:t>Admin Priya (101) logs in at https://oorjaman-admin.vercel.app and routes the booking to Gamusa.</w:t>
+        <w:t>Confirm Booking confirmed shows How you paid (Razorpay + Order / Payment IDs).</w:t>
+      </w:r>
+    </w:p>
+    <w:p>
+      <w:pPr>
+        <w:pStyle w:val="ListNumber"/>
+      </w:pPr>
+      <w:r>
+        <w:t>Admin Priya (101) logs in at https://oorjaman-admin.vercel.app, confirms the payment under Finance → Payments, and routes the booking to Gamusa if needed.</w:t>
       </w:r>
     </w:p>
     <w:p>
@@ -2168,6 +3813,14 @@
       </w:pPr>
       <w:r>
         <w:t>Customer Raju checks Bookings and Activity—the visit shows as completed.</w:t>
+      </w:r>
+    </w:p>
+    <w:p>
+      <w:pPr>
+        <w:pStyle w:val="ListNumber"/>
+      </w:pPr>
+      <w:r>
+        <w:t>Optional second pass: book Pay after service, complete the job, collect via technician QR / customer pay outstanding.</w:t>
       </w:r>
     </w:p>
     <w:p>
@@ -2258,7 +3911,7 @@
         <w:t xml:space="preserve">☐ </w:t>
       </w:r>
       <w:r>
-        <w:t>Customer can book a visit.</w:t>
+        <w:t>Customer can book with Pay now (Razorpay success card).</w:t>
       </w:r>
     </w:p>
     <w:p>
@@ -2272,7 +3925,49 @@
         <w:t xml:space="preserve">☐ </w:t>
       </w:r>
       <w:r>
-        <w:t>Admin can route a booking.</w:t>
+        <w:t>Booking confirmed shows How you paid details.</w:t>
+      </w:r>
+    </w:p>
+    <w:p>
+      <w:pPr>
+        <w:pStyle w:val="ListBullet"/>
+      </w:pPr>
+      <w:r>
+        <w:rPr>
+          <w:b/>
+        </w:rPr>
+        <w:t xml:space="preserve">☐ </w:t>
+      </w:r>
+      <w:r>
+        <w:t>At least one Razorpay failure card was tried (retry works).</w:t>
+      </w:r>
+    </w:p>
+    <w:p>
+      <w:pPr>
+        <w:pStyle w:val="ListBullet"/>
+      </w:pPr>
+      <w:r>
+        <w:rPr>
+          <w:b/>
+        </w:rPr>
+        <w:t xml:space="preserve">☐ </w:t>
+      </w:r>
+      <w:r>
+        <w:t>Customer can book with Pay after service.</w:t>
+      </w:r>
+    </w:p>
+    <w:p>
+      <w:pPr>
+        <w:pStyle w:val="ListBullet"/>
+      </w:pPr>
+      <w:r>
+        <w:rPr>
+          <w:b/>
+        </w:rPr>
+        <w:t xml:space="preserve">☐ </w:t>
+      </w:r>
+      <w:r>
+        <w:t>Admin can route a booking and view Payments ops.</w:t>
       </w:r>
     </w:p>
     <w:p>
@@ -2301,6 +3996,20 @@
       </w:r>
       <w:r>
         <w:t>Technician can complete a visit.</w:t>
+      </w:r>
+    </w:p>
+    <w:p>
+      <w:pPr>
+        <w:pStyle w:val="ListBullet"/>
+      </w:pPr>
+      <w:r>
+        <w:rPr>
+          <w:b/>
+        </w:rPr>
+        <w:t xml:space="preserve">☐ </w:t>
+      </w:r>
+      <w:r>
+        <w:t>Pay-later collect path tested once (section 7.4).</w:t>
       </w:r>
     </w:p>
     <w:p>

</xml_diff>